<commit_message>
Ajuste en la funcion crearReporteWord, se agrego en la funcion que reiniciamos a 1 el valor de la variable screenshotCounter
</commit_message>
<xml_diff>
--- a/evidencias/carpetaScenario2/reporteDeCasoDePruebaScenario2.docx
+++ b/evidencias/carpetaScenario2/reporteDeCasoDePruebaScenario2.docx
@@ -9,12 +9,12 @@
         <w:drawing>
           <wp:inline distT="0" distR="0" distB="0" distL="0">
             <wp:extent cx="3810000" cy="2540000"/>
-            <wp:docPr id="0" name="Drawing 0" descr="004Se_abre_el_navegador.png"/>
+            <wp:docPr id="0" name="Drawing 0" descr="001Se_abre_el_navegador.png"/>
             <a:graphic xmlns:a="http://schemas.openxmlformats.org/drawingml/2006/main">
               <a:graphicData uri="http://schemas.openxmlformats.org/drawingml/2006/picture">
                 <pic:pic xmlns:pic="http://schemas.openxmlformats.org/drawingml/2006/picture">
                   <pic:nvPicPr>
-                    <pic:cNvPr id="0" name="Picture 0" descr="004Se_abre_el_navegador.png"/>
+                    <pic:cNvPr id="0" name="Picture 0" descr="001Se_abre_el_navegador.png"/>
                     <pic:cNvPicPr>
                       <a:picLocks noChangeAspect="true"/>
                     </pic:cNvPicPr>
@@ -49,12 +49,12 @@
         <w:drawing>
           <wp:inline distT="0" distR="0" distB="0" distL="0">
             <wp:extent cx="3810000" cy="2540000"/>
-            <wp:docPr id="1" name="Drawing 1" descr="005Se_da_un_click_en_le_menu_Categorias.png"/>
+            <wp:docPr id="1" name="Drawing 1" descr="002Se_da_un_click_en_le_menu_Categorias.png"/>
             <a:graphic xmlns:a="http://schemas.openxmlformats.org/drawingml/2006/main">
               <a:graphicData uri="http://schemas.openxmlformats.org/drawingml/2006/picture">
                 <pic:pic xmlns:pic="http://schemas.openxmlformats.org/drawingml/2006/picture">
                   <pic:nvPicPr>
-                    <pic:cNvPr id="0" name="Picture 1" descr="005Se_da_un_click_en_le_menu_Categorias.png"/>
+                    <pic:cNvPr id="0" name="Picture 1" descr="002Se_da_un_click_en_le_menu_Categorias.png"/>
                     <pic:cNvPicPr>
                       <a:picLocks noChangeAspect="true"/>
                     </pic:cNvPicPr>

</xml_diff>